<commit_message>
docs: enrich user manual with high-fidelity UI mockups
</commit_message>
<xml_diff>
--- a/Project-Mannager-System/huong-dan-su-dung.docx
+++ b/Project-Mannager-System/huong-dan-su-dung.docx
@@ -139,6 +139,66 @@
     </w:p>
     <w:p>
       <w:pPr>
+        <w:spacing w:after="120"/>
+      </w:pPr>
+      <w:r>
+        <w:rPr>
+          <w:b w:val="false"/>
+          <w:bCs w:val="false"/>
+          <w:sz w:val="24"/>
+          <w:szCs w:val="24"/>
+        </w:rPr>
+        <w:t xml:space="preserve">Dưới đây là giao diện màn hình Đăng nhập của ứng dụng:</w:t>
+      </w:r>
+    </w:p>
+    <w:p>
+      <w:pPr>
+        <w:spacing w:after="200" w:before="120"/>
+        <w:jc w:val="center"/>
+      </w:pPr>
+      <w:r>
+        <w:drawing>
+          <wp:inline distT="0" distB="0" distL="0" distR="0">
+            <wp:extent cx="5238750" cy="2943225"/>
+            <wp:effectExtent t="0" r="0" b="0" l="0"/>
+            <wp:docPr id="1" name="" descr="" title=""/>
+            <wp:cNvGraphicFramePr>
+              <a:graphicFrameLocks xmlns:a="http://schemas.openxmlformats.org/drawingml/2006/main" noChangeAspect="1"/>
+            </wp:cNvGraphicFramePr>
+            <a:graphic xmlns:a="http://schemas.openxmlformats.org/drawingml/2006/main">
+              <a:graphicData uri="http://schemas.openxmlformats.org/drawingml/2006/picture">
+                <pic:pic xmlns:pic="http://schemas.openxmlformats.org/drawingml/2006/picture">
+                  <pic:nvPicPr>
+                    <pic:cNvPr id="0" name="" descr=""/>
+                    <pic:cNvPicPr>
+                      <a:picLocks noChangeAspect="1" noChangeArrowheads="1"/>
+                    </pic:cNvPicPr>
+                  </pic:nvPicPr>
+                  <pic:blipFill>
+                    <a:blip r:embed="rId7" cstate="none"/>
+                    <a:srcRect/>
+                    <a:stretch>
+                      <a:fillRect/>
+                    </a:stretch>
+                  </pic:blipFill>
+                  <pic:spPr bwMode="auto">
+                    <a:xfrm>
+                      <a:off x="0" y="0"/>
+                      <a:ext cx="5238750" cy="2943225"/>
+                    </a:xfrm>
+                    <a:prstGeom prst="rect">
+                      <a:avLst/>
+                    </a:prstGeom>
+                  </pic:spPr>
+                </pic:pic>
+              </a:graphicData>
+            </a:graphic>
+          </wp:inline>
+        </w:drawing>
+      </w:r>
+    </w:p>
+    <w:p>
+      <w:pPr>
         <w:pStyle w:val="Heading1"/>
         <w:spacing w:after="120" w:before="240"/>
       </w:pPr>
@@ -186,6 +246,66 @@
           <w:szCs w:val="24"/>
         </w:rPr>
         <w:t xml:space="preserve">Thành viên tham gia: PM Minh (Vai trò PM), Dev Hùng (Vai trò Developer), QA Lan (Vai trò Tester).</w:t>
+      </w:r>
+    </w:p>
+    <w:p>
+      <w:pPr>
+        <w:spacing w:after="120"/>
+      </w:pPr>
+      <w:r>
+        <w:rPr>
+          <w:b w:val="false"/>
+          <w:bCs w:val="false"/>
+          <w:sz w:val="24"/>
+          <w:szCs w:val="24"/>
+        </w:rPr>
+        <w:t xml:space="preserve">Dưới đây là giao diện màn hình Dashboard chung sau khi dự án đã đi vào hoạt động ổn định:</w:t>
+      </w:r>
+    </w:p>
+    <w:p>
+      <w:pPr>
+        <w:spacing w:after="200" w:before="120"/>
+        <w:jc w:val="center"/>
+      </w:pPr>
+      <w:r>
+        <w:drawing>
+          <wp:inline distT="0" distB="0" distL="0" distR="0">
+            <wp:extent cx="5238750" cy="2943225"/>
+            <wp:effectExtent t="0" r="0" b="0" l="0"/>
+            <wp:docPr id="1" name="" descr="" title=""/>
+            <wp:cNvGraphicFramePr>
+              <a:graphicFrameLocks xmlns:a="http://schemas.openxmlformats.org/drawingml/2006/main" noChangeAspect="1"/>
+            </wp:cNvGraphicFramePr>
+            <a:graphic xmlns:a="http://schemas.openxmlformats.org/drawingml/2006/main">
+              <a:graphicData uri="http://schemas.openxmlformats.org/drawingml/2006/picture">
+                <pic:pic xmlns:pic="http://schemas.openxmlformats.org/drawingml/2006/picture">
+                  <pic:nvPicPr>
+                    <pic:cNvPr id="0" name="" descr=""/>
+                    <pic:cNvPicPr>
+                      <a:picLocks noChangeAspect="1" noChangeArrowheads="1"/>
+                    </pic:cNvPicPr>
+                  </pic:nvPicPr>
+                  <pic:blipFill>
+                    <a:blip r:embed="rId8" cstate="none"/>
+                    <a:srcRect/>
+                    <a:stretch>
+                      <a:fillRect/>
+                    </a:stretch>
+                  </pic:blipFill>
+                  <pic:spPr bwMode="auto">
+                    <a:xfrm>
+                      <a:off x="0" y="0"/>
+                      <a:ext cx="5238750" cy="2943225"/>
+                    </a:xfrm>
+                    <a:prstGeom prst="rect">
+                      <a:avLst/>
+                    </a:prstGeom>
+                  </pic:spPr>
+                </pic:pic>
+              </a:graphicData>
+            </a:graphic>
+          </wp:inline>
+        </w:drawing>
       </w:r>
     </w:p>
     <w:p>
@@ -572,6 +692,66 @@
       </w:pPr>
       <w:r>
         <w:rPr>
+          <w:b w:val="false"/>
+          <w:bCs w:val="false"/>
+          <w:sz w:val="24"/>
+          <w:szCs w:val="24"/>
+        </w:rPr>
+        <w:t xml:space="preserve">Dưới đây là giao diện màn hình lập kế hoạch WBS kết hợp Gantt SVG đường găng:</w:t>
+      </w:r>
+    </w:p>
+    <w:p>
+      <w:pPr>
+        <w:spacing w:after="200" w:before="120"/>
+        <w:jc w:val="center"/>
+      </w:pPr>
+      <w:r>
+        <w:drawing>
+          <wp:inline distT="0" distB="0" distL="0" distR="0">
+            <wp:extent cx="5238750" cy="2943225"/>
+            <wp:effectExtent t="0" r="0" b="0" l="0"/>
+            <wp:docPr id="1" name="" descr="" title=""/>
+            <wp:cNvGraphicFramePr>
+              <a:graphicFrameLocks xmlns:a="http://schemas.openxmlformats.org/drawingml/2006/main" noChangeAspect="1"/>
+            </wp:cNvGraphicFramePr>
+            <a:graphic xmlns:a="http://schemas.openxmlformats.org/drawingml/2006/main">
+              <a:graphicData uri="http://schemas.openxmlformats.org/drawingml/2006/picture">
+                <pic:pic xmlns:pic="http://schemas.openxmlformats.org/drawingml/2006/picture">
+                  <pic:nvPicPr>
+                    <pic:cNvPr id="0" name="" descr=""/>
+                    <pic:cNvPicPr>
+                      <a:picLocks noChangeAspect="1" noChangeArrowheads="1"/>
+                    </pic:cNvPicPr>
+                  </pic:nvPicPr>
+                  <pic:blipFill>
+                    <a:blip r:embed="rId9" cstate="none"/>
+                    <a:srcRect/>
+                    <a:stretch>
+                      <a:fillRect/>
+                    </a:stretch>
+                  </pic:blipFill>
+                  <pic:spPr bwMode="auto">
+                    <a:xfrm>
+                      <a:off x="0" y="0"/>
+                      <a:ext cx="5238750" cy="2943225"/>
+                    </a:xfrm>
+                    <a:prstGeom prst="rect">
+                      <a:avLst/>
+                    </a:prstGeom>
+                  </pic:spPr>
+                </pic:pic>
+              </a:graphicData>
+            </a:graphic>
+          </wp:inline>
+        </w:drawing>
+      </w:r>
+    </w:p>
+    <w:p>
+      <w:pPr>
+        <w:spacing w:after="120"/>
+      </w:pPr>
+      <w:r>
+        <w:rPr>
           <w:b/>
           <w:bCs/>
           <w:sz w:val="24"/>
@@ -671,6 +851,66 @@
           <w:szCs w:val="24"/>
         </w:rPr>
         <w:t xml:space="preserve">2. Kéo thả Task '2.1 Code Backend API' từ cột 'Cần làm' sang 'Đang làm' để báo cáo tiến độ.</w:t>
+      </w:r>
+    </w:p>
+    <w:p>
+      <w:pPr>
+        <w:spacing w:after="120"/>
+      </w:pPr>
+      <w:r>
+        <w:rPr>
+          <w:b w:val="false"/>
+          <w:bCs w:val="false"/>
+          <w:sz w:val="24"/>
+          <w:szCs w:val="24"/>
+        </w:rPr>
+        <w:t xml:space="preserve">Dưới đây là giao diện Kanban board cập nhật công việc:</w:t>
+      </w:r>
+    </w:p>
+    <w:p>
+      <w:pPr>
+        <w:spacing w:after="200" w:before="120"/>
+        <w:jc w:val="center"/>
+      </w:pPr>
+      <w:r>
+        <w:drawing>
+          <wp:inline distT="0" distB="0" distL="0" distR="0">
+            <wp:extent cx="5238750" cy="2943225"/>
+            <wp:effectExtent t="0" r="0" b="0" l="0"/>
+            <wp:docPr id="1" name="" descr="" title=""/>
+            <wp:cNvGraphicFramePr>
+              <a:graphicFrameLocks xmlns:a="http://schemas.openxmlformats.org/drawingml/2006/main" noChangeAspect="1"/>
+            </wp:cNvGraphicFramePr>
+            <a:graphic xmlns:a="http://schemas.openxmlformats.org/drawingml/2006/main">
+              <a:graphicData uri="http://schemas.openxmlformats.org/drawingml/2006/picture">
+                <pic:pic xmlns:pic="http://schemas.openxmlformats.org/drawingml/2006/picture">
+                  <pic:nvPicPr>
+                    <pic:cNvPr id="0" name="" descr=""/>
+                    <pic:cNvPicPr>
+                      <a:picLocks noChangeAspect="1" noChangeArrowheads="1"/>
+                    </pic:cNvPicPr>
+                  </pic:nvPicPr>
+                  <pic:blipFill>
+                    <a:blip r:embed="rId10" cstate="none"/>
+                    <a:srcRect/>
+                    <a:stretch>
+                      <a:fillRect/>
+                    </a:stretch>
+                  </pic:blipFill>
+                  <pic:spPr bwMode="auto">
+                    <a:xfrm>
+                      <a:off x="0" y="0"/>
+                      <a:ext cx="5238750" cy="2943225"/>
+                    </a:xfrm>
+                    <a:prstGeom prst="rect">
+                      <a:avLst/>
+                    </a:prstGeom>
+                  </pic:spPr>
+                </pic:pic>
+              </a:graphicData>
+            </a:graphic>
+          </wp:inline>
+        </w:drawing>
       </w:r>
     </w:p>
     <w:p>
@@ -886,6 +1126,66 @@
     </w:p>
     <w:p>
       <w:pPr>
+        <w:spacing w:after="120"/>
+      </w:pPr>
+      <w:r>
+        <w:rPr>
+          <w:b w:val="false"/>
+          <w:bCs w:val="false"/>
+          <w:sz w:val="24"/>
+          <w:szCs w:val="24"/>
+        </w:rPr>
+        <w:t xml:space="preserve">Dưới đây là giao diện thực thi kịch bản kiểm thử tự động báo Bug:</w:t>
+      </w:r>
+    </w:p>
+    <w:p>
+      <w:pPr>
+        <w:spacing w:after="200" w:before="120"/>
+        <w:jc w:val="center"/>
+      </w:pPr>
+      <w:r>
+        <w:drawing>
+          <wp:inline distT="0" distB="0" distL="0" distR="0">
+            <wp:extent cx="5238750" cy="2943225"/>
+            <wp:effectExtent t="0" r="0" b="0" l="0"/>
+            <wp:docPr id="1" name="" descr="" title=""/>
+            <wp:cNvGraphicFramePr>
+              <a:graphicFrameLocks xmlns:a="http://schemas.openxmlformats.org/drawingml/2006/main" noChangeAspect="1"/>
+            </wp:cNvGraphicFramePr>
+            <a:graphic xmlns:a="http://schemas.openxmlformats.org/drawingml/2006/main">
+              <a:graphicData uri="http://schemas.openxmlformats.org/drawingml/2006/picture">
+                <pic:pic xmlns:pic="http://schemas.openxmlformats.org/drawingml/2006/picture">
+                  <pic:nvPicPr>
+                    <pic:cNvPr id="0" name="" descr=""/>
+                    <pic:cNvPicPr>
+                      <a:picLocks noChangeAspect="1" noChangeArrowheads="1"/>
+                    </pic:cNvPicPr>
+                  </pic:nvPicPr>
+                  <pic:blipFill>
+                    <a:blip r:embed="rId11" cstate="none"/>
+                    <a:srcRect/>
+                    <a:stretch>
+                      <a:fillRect/>
+                    </a:stretch>
+                  </pic:blipFill>
+                  <pic:spPr bwMode="auto">
+                    <a:xfrm>
+                      <a:off x="0" y="0"/>
+                      <a:ext cx="5238750" cy="2943225"/>
+                    </a:xfrm>
+                    <a:prstGeom prst="rect">
+                      <a:avLst/>
+                    </a:prstGeom>
+                  </pic:spPr>
+                </pic:pic>
+              </a:graphicData>
+            </a:graphic>
+          </wp:inline>
+        </w:drawing>
+      </w:r>
+    </w:p>
+    <w:p>
+      <w:pPr>
         <w:pStyle w:val="Heading1"/>
         <w:spacing w:after="120" w:before="240"/>
       </w:pPr>
@@ -1004,6 +1304,66 @@
           <w:szCs w:val="24"/>
         </w:rPr>
         <w:t xml:space="preserve">PM Minh truy cập vào tab Tài chính (Finance) để xem biểu đồ SVG trực quan hóa các đường cong PV, EV, AC và đưa ra các dự báo ngày hoàn thành chính xác.</w:t>
+      </w:r>
+    </w:p>
+    <w:p>
+      <w:pPr>
+        <w:spacing w:after="120"/>
+      </w:pPr>
+      <w:r>
+        <w:rPr>
+          <w:b w:val="false"/>
+          <w:bCs w:val="false"/>
+          <w:sz w:val="24"/>
+          <w:szCs w:val="24"/>
+        </w:rPr>
+        <w:t xml:space="preserve">Dưới đây là giao diện phân tích sức khỏe tài chính dự án EVM:</w:t>
+      </w:r>
+    </w:p>
+    <w:p>
+      <w:pPr>
+        <w:spacing w:after="200" w:before="120"/>
+        <w:jc w:val="center"/>
+      </w:pPr>
+      <w:r>
+        <w:drawing>
+          <wp:inline distT="0" distB="0" distL="0" distR="0">
+            <wp:extent cx="5238750" cy="2943225"/>
+            <wp:effectExtent t="0" r="0" b="0" l="0"/>
+            <wp:docPr id="1" name="" descr="" title=""/>
+            <wp:cNvGraphicFramePr>
+              <a:graphicFrameLocks xmlns:a="http://schemas.openxmlformats.org/drawingml/2006/main" noChangeAspect="1"/>
+            </wp:cNvGraphicFramePr>
+            <a:graphic xmlns:a="http://schemas.openxmlformats.org/drawingml/2006/main">
+              <a:graphicData uri="http://schemas.openxmlformats.org/drawingml/2006/picture">
+                <pic:pic xmlns:pic="http://schemas.openxmlformats.org/drawingml/2006/picture">
+                  <pic:nvPicPr>
+                    <pic:cNvPr id="0" name="" descr=""/>
+                    <pic:cNvPicPr>
+                      <a:picLocks noChangeAspect="1" noChangeArrowheads="1"/>
+                    </pic:cNvPicPr>
+                  </pic:nvPicPr>
+                  <pic:blipFill>
+                    <a:blip r:embed="rId12" cstate="none"/>
+                    <a:srcRect/>
+                    <a:stretch>
+                      <a:fillRect/>
+                    </a:stretch>
+                  </pic:blipFill>
+                  <pic:spPr bwMode="auto">
+                    <a:xfrm>
+                      <a:off x="0" y="0"/>
+                      <a:ext cx="5238750" cy="2943225"/>
+                    </a:xfrm>
+                    <a:prstGeom prst="rect">
+                      <a:avLst/>
+                    </a:prstGeom>
+                  </pic:spPr>
+                </pic:pic>
+              </a:graphicData>
+            </a:graphic>
+          </wp:inline>
+        </w:drawing>
       </w:r>
     </w:p>
     <w:p>

</xml_diff>